<commit_message>
Expand Word deliverable to full Deliverable 1 (design options + decision matrix)
- build_report.py: add sections 10 capacity feasibility, 11 design options, 12 decision matrix; renumber assumptions to 13; fix metrics path
- Deliverable1 .docx now 13 sections / 11 tables / 8 figures incl. recommendation (Option B)

Co-Authored-By: Claude Opus 4.8 <noreply@anthropic.com>
</commit_message>
<xml_diff>
--- a/outputs/reports/Deliverable1_Analysis_DRAFT.docx
+++ b/outputs/reports/Deliverable1_Analysis_DRAFT.docx
@@ -321,7 +321,7 @@
               <w:rPr>
                 <w:sz w:val="19"/>
               </w:rPr>
-              <w:t>DRAFT — analysis portion (design options / equipment to follow)</w:t>
+              <w:t>DRAFT — analysis, design options, policies &amp; recommendation</w:t>
             </w:r>
           </w:p>
         </w:tc>
@@ -343,7 +343,7 @@
           <w:color w:val="666666"/>
           <w:sz w:val="18"/>
         </w:rPr>
-        <w:t>This is a working draft covering the data-analysis portion of Deliverable 1. The design-choice pre-selection, policy substantiation and equipment selection (also part of Deliverable 1) are added as those work phases complete. All figures are measured from the provided Assa Abloy data; nothing is fabricated.</w:t>
+        <w:t>This draft covers Deliverable 1 end-to-end: data analysis, storage-capacity feasibility, three design options, policy pre-selection, equipment, and a recommended concept with a decision matrix. All figures are measured from the provided Assa Abloy data or computed by the analysis scripts; nothing is fabricated, and open assumptions are listed in Section 13.</w:t>
       </w:r>
     </w:p>
     <w:p>
@@ -3605,7 +3605,1809 @@
         <w:pStyle w:val="Heading1"/>
       </w:pPr>
       <w:r>
-        <w:t>10. Assumptions &amp; open questions</w:t>
+        <w:t>10. Storage capacity feasibility</w:t>
+      </w:r>
+    </w:p>
+    <w:p>
+      <w:pPr>
+        <w:spacing w:after="120"/>
+      </w:pPr>
+      <w:r>
+        <w:rPr>
+          <w:b w:val="0"/>
+          <w:i w:val="0"/>
+          <w:color w:val="222222"/>
+          <w:sz w:val="21"/>
+        </w:rPr>
+        <w:t>Design target: peak 11,015 concurrent loads × 1.15 growth/safety buffer ÷ 0.90 target utilisation = **~14,074 pallet positions**. Measured pallet+load height is low (p90 116 cm), giving a 1.41 m level pitch and up to 8 levels under 12.2 m.</w:t>
+      </w:r>
+    </w:p>
+    <w:p>
+      <w:pPr>
+        <w:spacing w:after="120"/>
+      </w:pPr>
+      <w:r>
+        <w:rPr>
+          <w:b w:val="0"/>
+          <w:i w:val="0"/>
+          <w:color w:val="222222"/>
+          <w:sz w:val="21"/>
+        </w:rPr>
+        <w:t>Bottom-up floor area needed to hold that target, by storage concept:</w:t>
+      </w:r>
+    </w:p>
+    <w:tbl>
+      <w:tblPr>
+        <w:tblStyle w:val="LightGrid-Accent1"/>
+        <w:tblW w:type="auto" w:w="0"/>
+        <w:jc w:val="center"/>
+        <w:tblLook w:firstColumn="1" w:firstRow="1" w:lastColumn="0" w:lastRow="0" w:noHBand="0" w:noVBand="1" w:val="04A0"/>
+      </w:tblPr>
+      <w:tblGrid>
+        <w:gridCol w:w="1440"/>
+        <w:gridCol w:w="1440"/>
+        <w:gridCol w:w="1440"/>
+        <w:gridCol w:w="1440"/>
+        <w:gridCol w:w="1440"/>
+        <w:gridCol w:w="1440"/>
+      </w:tblGrid>
+      <w:tr>
+        <w:tc>
+          <w:tcPr>
+            <w:tcW w:type="dxa" w:w="2268"/>
+          </w:tcPr>
+          <w:p>
+            <w:r/>
+            <w:r>
+              <w:rPr>
+                <w:b/>
+                <w:sz w:val="19"/>
+              </w:rPr>
+              <w:t>Concept</w:t>
+            </w:r>
+          </w:p>
+        </w:tc>
+        <w:tc>
+          <w:tcPr>
+            <w:tcW w:type="dxa" w:w="1871"/>
+          </w:tcPr>
+          <w:p>
+            <w:r/>
+            <w:r>
+              <w:rPr>
+                <w:b/>
+                <w:sz w:val="19"/>
+              </w:rPr>
+              <w:t>MHE</w:t>
+            </w:r>
+          </w:p>
+        </w:tc>
+        <w:tc>
+          <w:tcPr>
+            <w:tcW w:type="dxa" w:w="850"/>
+          </w:tcPr>
+          <w:p>
+            <w:r/>
+            <w:r>
+              <w:rPr>
+                <w:b/>
+                <w:sz w:val="19"/>
+              </w:rPr>
+              <w:t>Levels</w:t>
+            </w:r>
+          </w:p>
+        </w:tc>
+        <w:tc>
+          <w:tcPr>
+            <w:tcW w:type="dxa" w:w="1474"/>
+          </w:tcPr>
+          <w:p>
+            <w:r/>
+            <w:r>
+              <w:rPr>
+                <w:b/>
+                <w:sz w:val="19"/>
+              </w:rPr>
+              <w:t>Total area m² *</w:t>
+            </w:r>
+          </w:p>
+        </w:tc>
+        <w:tc>
+          <w:tcPr>
+            <w:tcW w:type="dxa" w:w="1361"/>
+          </w:tcPr>
+          <w:p>
+            <w:r/>
+            <w:r>
+              <w:rPr>
+                <w:b/>
+                <w:sz w:val="19"/>
+              </w:rPr>
+              <w:t>% of 7,000 m²</w:t>
+            </w:r>
+          </w:p>
+        </w:tc>
+        <w:tc>
+          <w:tcPr>
+            <w:tcW w:type="dxa" w:w="1020"/>
+          </w:tcPr>
+          <w:p>
+            <w:r/>
+            <w:r>
+              <w:rPr>
+                <w:b/>
+                <w:sz w:val="19"/>
+              </w:rPr>
+              <w:t>Fits?</w:t>
+            </w:r>
+          </w:p>
+        </w:tc>
+      </w:tr>
+      <w:tr>
+        <w:tc>
+          <w:tcPr>
+            <w:tcW w:type="dxa" w:w="2268"/>
+          </w:tcPr>
+          <w:p>
+            <w:r/>
+            <w:r>
+              <w:rPr>
+                <w:sz w:val="19"/>
+              </w:rPr>
+              <w:t>Selective - wide aisle</w:t>
+            </w:r>
+          </w:p>
+        </w:tc>
+        <w:tc>
+          <w:tcPr>
+            <w:tcW w:type="dxa" w:w="1871"/>
+          </w:tcPr>
+          <w:p>
+            <w:pPr>
+              <w:jc w:val="right"/>
+            </w:pPr>
+            <w:r/>
+            <w:r>
+              <w:rPr>
+                <w:sz w:val="19"/>
+              </w:rPr>
+              <w:t>Counterbalance FLT</w:t>
+            </w:r>
+          </w:p>
+        </w:tc>
+        <w:tc>
+          <w:tcPr>
+            <w:tcW w:type="dxa" w:w="850"/>
+          </w:tcPr>
+          <w:p>
+            <w:pPr>
+              <w:jc w:val="right"/>
+            </w:pPr>
+            <w:r/>
+            <w:r>
+              <w:rPr>
+                <w:sz w:val="19"/>
+              </w:rPr>
+              <w:t>6</w:t>
+            </w:r>
+          </w:p>
+        </w:tc>
+        <w:tc>
+          <w:tcPr>
+            <w:tcW w:type="dxa" w:w="1474"/>
+          </w:tcPr>
+          <w:p>
+            <w:pPr>
+              <w:jc w:val="right"/>
+            </w:pPr>
+            <w:r/>
+            <w:r>
+              <w:rPr>
+                <w:sz w:val="19"/>
+              </w:rPr>
+              <w:t>10,085</w:t>
+            </w:r>
+          </w:p>
+        </w:tc>
+        <w:tc>
+          <w:tcPr>
+            <w:tcW w:type="dxa" w:w="1361"/>
+          </w:tcPr>
+          <w:p>
+            <w:pPr>
+              <w:jc w:val="right"/>
+            </w:pPr>
+            <w:r/>
+            <w:r>
+              <w:rPr>
+                <w:sz w:val="19"/>
+              </w:rPr>
+              <w:t>144%</w:t>
+            </w:r>
+          </w:p>
+        </w:tc>
+        <w:tc>
+          <w:tcPr>
+            <w:tcW w:type="dxa" w:w="1020"/>
+          </w:tcPr>
+          <w:p>
+            <w:pPr>
+              <w:jc w:val="right"/>
+            </w:pPr>
+            <w:r/>
+            <w:r>
+              <w:rPr>
+                <w:sz w:val="19"/>
+              </w:rPr>
+              <w:t>TIGHT/NO</w:t>
+            </w:r>
+          </w:p>
+        </w:tc>
+      </w:tr>
+      <w:tr>
+        <w:tc>
+          <w:tcPr>
+            <w:tcW w:type="dxa" w:w="2268"/>
+          </w:tcPr>
+          <w:p>
+            <w:r/>
+            <w:r>
+              <w:rPr>
+                <w:sz w:val="19"/>
+              </w:rPr>
+              <w:t>Selective - narrow aisle</w:t>
+            </w:r>
+          </w:p>
+        </w:tc>
+        <w:tc>
+          <w:tcPr>
+            <w:tcW w:type="dxa" w:w="1871"/>
+          </w:tcPr>
+          <w:p>
+            <w:pPr>
+              <w:jc w:val="right"/>
+            </w:pPr>
+            <w:r/>
+            <w:r>
+              <w:rPr>
+                <w:sz w:val="19"/>
+              </w:rPr>
+              <w:t>Reach truck</w:t>
+            </w:r>
+          </w:p>
+        </w:tc>
+        <w:tc>
+          <w:tcPr>
+            <w:tcW w:type="dxa" w:w="850"/>
+          </w:tcPr>
+          <w:p>
+            <w:pPr>
+              <w:jc w:val="right"/>
+            </w:pPr>
+            <w:r/>
+            <w:r>
+              <w:rPr>
+                <w:sz w:val="19"/>
+              </w:rPr>
+              <w:t>7</w:t>
+            </w:r>
+          </w:p>
+        </w:tc>
+        <w:tc>
+          <w:tcPr>
+            <w:tcW w:type="dxa" w:w="1474"/>
+          </w:tcPr>
+          <w:p>
+            <w:pPr>
+              <w:jc w:val="right"/>
+            </w:pPr>
+            <w:r/>
+            <w:r>
+              <w:rPr>
+                <w:sz w:val="19"/>
+              </w:rPr>
+              <w:t>7,472</w:t>
+            </w:r>
+          </w:p>
+        </w:tc>
+        <w:tc>
+          <w:tcPr>
+            <w:tcW w:type="dxa" w:w="1361"/>
+          </w:tcPr>
+          <w:p>
+            <w:pPr>
+              <w:jc w:val="right"/>
+            </w:pPr>
+            <w:r/>
+            <w:r>
+              <w:rPr>
+                <w:sz w:val="19"/>
+              </w:rPr>
+              <w:t>107%</w:t>
+            </w:r>
+          </w:p>
+        </w:tc>
+        <w:tc>
+          <w:tcPr>
+            <w:tcW w:type="dxa" w:w="1020"/>
+          </w:tcPr>
+          <w:p>
+            <w:pPr>
+              <w:jc w:val="right"/>
+            </w:pPr>
+            <w:r/>
+            <w:r>
+              <w:rPr>
+                <w:sz w:val="19"/>
+              </w:rPr>
+              <w:t>TIGHT/NO</w:t>
+            </w:r>
+          </w:p>
+        </w:tc>
+      </w:tr>
+      <w:tr>
+        <w:tc>
+          <w:tcPr>
+            <w:tcW w:type="dxa" w:w="2268"/>
+          </w:tcPr>
+          <w:p>
+            <w:r/>
+            <w:r>
+              <w:rPr>
+                <w:sz w:val="19"/>
+              </w:rPr>
+              <w:t>Double-deep</w:t>
+            </w:r>
+          </w:p>
+        </w:tc>
+        <w:tc>
+          <w:tcPr>
+            <w:tcW w:type="dxa" w:w="1871"/>
+          </w:tcPr>
+          <w:p>
+            <w:pPr>
+              <w:jc w:val="right"/>
+            </w:pPr>
+            <w:r/>
+            <w:r>
+              <w:rPr>
+                <w:sz w:val="19"/>
+              </w:rPr>
+              <w:t>Reach truck (deep)</w:t>
+            </w:r>
+          </w:p>
+        </w:tc>
+        <w:tc>
+          <w:tcPr>
+            <w:tcW w:type="dxa" w:w="850"/>
+          </w:tcPr>
+          <w:p>
+            <w:pPr>
+              <w:jc w:val="right"/>
+            </w:pPr>
+            <w:r/>
+            <w:r>
+              <w:rPr>
+                <w:sz w:val="19"/>
+              </w:rPr>
+              <w:t>7</w:t>
+            </w:r>
+          </w:p>
+        </w:tc>
+        <w:tc>
+          <w:tcPr>
+            <w:tcW w:type="dxa" w:w="1474"/>
+          </w:tcPr>
+          <w:p>
+            <w:pPr>
+              <w:jc w:val="right"/>
+            </w:pPr>
+            <w:r/>
+            <w:r>
+              <w:rPr>
+                <w:sz w:val="19"/>
+              </w:rPr>
+              <w:t>6,351</w:t>
+            </w:r>
+          </w:p>
+        </w:tc>
+        <w:tc>
+          <w:tcPr>
+            <w:tcW w:type="dxa" w:w="1361"/>
+          </w:tcPr>
+          <w:p>
+            <w:pPr>
+              <w:jc w:val="right"/>
+            </w:pPr>
+            <w:r/>
+            <w:r>
+              <w:rPr>
+                <w:sz w:val="19"/>
+              </w:rPr>
+              <w:t>91%</w:t>
+            </w:r>
+          </w:p>
+        </w:tc>
+        <w:tc>
+          <w:tcPr>
+            <w:tcW w:type="dxa" w:w="1020"/>
+          </w:tcPr>
+          <w:p>
+            <w:pPr>
+              <w:jc w:val="right"/>
+            </w:pPr>
+            <w:r/>
+            <w:r>
+              <w:rPr>
+                <w:sz w:val="19"/>
+              </w:rPr>
+              <w:t>YES</w:t>
+            </w:r>
+          </w:p>
+        </w:tc>
+      </w:tr>
+      <w:tr>
+        <w:tc>
+          <w:tcPr>
+            <w:tcW w:type="dxa" w:w="2268"/>
+          </w:tcPr>
+          <w:p>
+            <w:r/>
+            <w:r>
+              <w:rPr>
+                <w:sz w:val="19"/>
+              </w:rPr>
+              <w:t>VNA</w:t>
+            </w:r>
+          </w:p>
+        </w:tc>
+        <w:tc>
+          <w:tcPr>
+            <w:tcW w:type="dxa" w:w="1871"/>
+          </w:tcPr>
+          <w:p>
+            <w:pPr>
+              <w:jc w:val="right"/>
+            </w:pPr>
+            <w:r/>
+            <w:r>
+              <w:rPr>
+                <w:sz w:val="19"/>
+              </w:rPr>
+              <w:t>VNA turret truck</w:t>
+            </w:r>
+          </w:p>
+        </w:tc>
+        <w:tc>
+          <w:tcPr>
+            <w:tcW w:type="dxa" w:w="850"/>
+          </w:tcPr>
+          <w:p>
+            <w:pPr>
+              <w:jc w:val="right"/>
+            </w:pPr>
+            <w:r/>
+            <w:r>
+              <w:rPr>
+                <w:sz w:val="19"/>
+              </w:rPr>
+              <w:t>8</w:t>
+            </w:r>
+          </w:p>
+        </w:tc>
+        <w:tc>
+          <w:tcPr>
+            <w:tcW w:type="dxa" w:w="1474"/>
+          </w:tcPr>
+          <w:p>
+            <w:pPr>
+              <w:jc w:val="right"/>
+            </w:pPr>
+            <w:r/>
+            <w:r>
+              <w:rPr>
+                <w:sz w:val="19"/>
+              </w:rPr>
+              <w:t>5,022</w:t>
+            </w:r>
+          </w:p>
+        </w:tc>
+        <w:tc>
+          <w:tcPr>
+            <w:tcW w:type="dxa" w:w="1361"/>
+          </w:tcPr>
+          <w:p>
+            <w:pPr>
+              <w:jc w:val="right"/>
+            </w:pPr>
+            <w:r/>
+            <w:r>
+              <w:rPr>
+                <w:sz w:val="19"/>
+              </w:rPr>
+              <w:t>72%</w:t>
+            </w:r>
+          </w:p>
+        </w:tc>
+        <w:tc>
+          <w:tcPr>
+            <w:tcW w:type="dxa" w:w="1020"/>
+          </w:tcPr>
+          <w:p>
+            <w:pPr>
+              <w:jc w:val="right"/>
+            </w:pPr>
+            <w:r/>
+            <w:r>
+              <w:rPr>
+                <w:sz w:val="19"/>
+              </w:rPr>
+              <w:t>YES</w:t>
+            </w:r>
+          </w:p>
+        </w:tc>
+      </w:tr>
+      <w:tr>
+        <w:tc>
+          <w:tcPr>
+            <w:tcW w:type="dxa" w:w="2268"/>
+          </w:tcPr>
+          <w:p>
+            <w:r/>
+            <w:r>
+              <w:rPr>
+                <w:sz w:val="19"/>
+              </w:rPr>
+              <w:t>Drive-in</w:t>
+            </w:r>
+          </w:p>
+        </w:tc>
+        <w:tc>
+          <w:tcPr>
+            <w:tcW w:type="dxa" w:w="1871"/>
+          </w:tcPr>
+          <w:p>
+            <w:pPr>
+              <w:jc w:val="right"/>
+            </w:pPr>
+            <w:r/>
+            <w:r>
+              <w:rPr>
+                <w:sz w:val="19"/>
+              </w:rPr>
+              <w:t>Counterbalance FLT</w:t>
+            </w:r>
+          </w:p>
+        </w:tc>
+        <w:tc>
+          <w:tcPr>
+            <w:tcW w:type="dxa" w:w="850"/>
+          </w:tcPr>
+          <w:p>
+            <w:pPr>
+              <w:jc w:val="right"/>
+            </w:pPr>
+            <w:r/>
+            <w:r>
+              <w:rPr>
+                <w:sz w:val="19"/>
+              </w:rPr>
+              <w:t>5</w:t>
+            </w:r>
+          </w:p>
+        </w:tc>
+        <w:tc>
+          <w:tcPr>
+            <w:tcW w:type="dxa" w:w="1474"/>
+          </w:tcPr>
+          <w:p>
+            <w:pPr>
+              <w:jc w:val="right"/>
+            </w:pPr>
+            <w:r/>
+            <w:r>
+              <w:rPr>
+                <w:sz w:val="19"/>
+              </w:rPr>
+              <w:t>9,369</w:t>
+            </w:r>
+          </w:p>
+        </w:tc>
+        <w:tc>
+          <w:tcPr>
+            <w:tcW w:type="dxa" w:w="1361"/>
+          </w:tcPr>
+          <w:p>
+            <w:pPr>
+              <w:jc w:val="right"/>
+            </w:pPr>
+            <w:r/>
+            <w:r>
+              <w:rPr>
+                <w:sz w:val="19"/>
+              </w:rPr>
+              <w:t>134%</w:t>
+            </w:r>
+          </w:p>
+        </w:tc>
+        <w:tc>
+          <w:tcPr>
+            <w:tcW w:type="dxa" w:w="1020"/>
+          </w:tcPr>
+          <w:p>
+            <w:pPr>
+              <w:jc w:val="right"/>
+            </w:pPr>
+            <w:r/>
+            <w:r>
+              <w:rPr>
+                <w:sz w:val="19"/>
+              </w:rPr>
+              <w:t>TIGHT/NO</w:t>
+            </w:r>
+          </w:p>
+        </w:tc>
+      </w:tr>
+    </w:tbl>
+    <w:p>
+      <w:pPr>
+        <w:spacing w:after="40"/>
+      </w:pPr>
+    </w:p>
+    <w:p>
+      <w:pPr>
+        <w:spacing w:after="120"/>
+      </w:pPr>
+      <w:r>
+        <w:rPr>
+          <w:b w:val="0"/>
+          <w:i/>
+          <w:color w:val="666666"/>
+          <w:sz w:val="17"/>
+        </w:rPr>
+        <w:t>* includes a 35% allowance for receiving, staging, pick, pack, ship, offices and circulation.</w:t>
+      </w:r>
+    </w:p>
+    <w:p>
+      <w:pPr>
+        <w:pStyle w:val="ListBullet"/>
+      </w:pPr>
+      <w:r>
+        <w:rPr>
+          <w:b w:val="0"/>
+          <w:sz w:val="21"/>
+        </w:rPr>
+      </w:r>
+      <w:r>
+        <w:rPr>
+          <w:b/>
+          <w:sz w:val="21"/>
+        </w:rPr>
+        <w:t>Conventional wide-aisle racking does not fit</w:t>
+      </w:r>
+      <w:r>
+        <w:rPr>
+          <w:b w:val="0"/>
+          <w:sz w:val="21"/>
+        </w:rPr>
+        <w:t xml:space="preserve"> (144% of the envelope); drive-in is also too space-hungry given the many single-load SKUs.</w:t>
+      </w:r>
+    </w:p>
+    <w:p>
+      <w:pPr>
+        <w:pStyle w:val="ListBullet"/>
+      </w:pPr>
+      <w:r>
+        <w:rPr>
+          <w:b w:val="0"/>
+          <w:sz w:val="21"/>
+        </w:rPr>
+      </w:r>
+      <w:r>
+        <w:rPr>
+          <w:b/>
+          <w:sz w:val="21"/>
+        </w:rPr>
+        <w:t>Double-deep (91%) and VNA (72%) fit comfortably</w:t>
+      </w:r>
+      <w:r>
+        <w:rPr>
+          <w:b w:val="0"/>
+          <w:sz w:val="21"/>
+        </w:rPr>
+        <w:t>; narrow-aisle single-deep is borderline (107%).</w:t>
+      </w:r>
+    </w:p>
+    <w:p>
+      <w:pPr>
+        <w:pStyle w:val="ListBullet"/>
+      </w:pPr>
+      <w:r>
+        <w:rPr>
+          <w:sz w:val="21"/>
+        </w:rPr>
+        <w:t>→ Higher-density storage is required, not optional — this shapes the options below.</w:t>
+      </w:r>
+    </w:p>
+    <w:p>
+      <w:pPr>
+        <w:jc w:val="center"/>
+      </w:pPr>
+      <w:r>
+        <w:drawing>
+          <wp:inline xmlns:a="http://schemas.openxmlformats.org/drawingml/2006/main" xmlns:pic="http://schemas.openxmlformats.org/drawingml/2006/picture">
+            <wp:extent cx="5040000" cy="2705954"/>
+            <wp:docPr id="7" name="Picture 7"/>
+            <wp:cNvGraphicFramePr>
+              <a:graphicFrameLocks noChangeAspect="1"/>
+            </wp:cNvGraphicFramePr>
+            <a:graphic>
+              <a:graphicData uri="http://schemas.openxmlformats.org/drawingml/2006/picture">
+                <pic:pic>
+                  <pic:nvPicPr>
+                    <pic:cNvPr id="0" name="capacity_concepts.png"/>
+                    <pic:cNvPicPr/>
+                  </pic:nvPicPr>
+                  <pic:blipFill>
+                    <a:blip r:embed="rId15"/>
+                    <a:stretch>
+                      <a:fillRect/>
+                    </a:stretch>
+                  </pic:blipFill>
+                  <pic:spPr>
+                    <a:xfrm>
+                      <a:off x="0" y="0"/>
+                      <a:ext cx="5040000" cy="2705954"/>
+                    </a:xfrm>
+                    <a:prstGeom prst="rect"/>
+                  </pic:spPr>
+                </pic:pic>
+              </a:graphicData>
+            </a:graphic>
+          </wp:inline>
+        </w:drawing>
+      </w:r>
+    </w:p>
+    <w:p>
+      <w:pPr>
+        <w:spacing w:after="200"/>
+        <w:jc w:val="center"/>
+      </w:pPr>
+      <w:r>
+        <w:rPr>
+          <w:b w:val="0"/>
+          <w:i/>
+          <w:color w:val="666666"/>
+          <w:sz w:val="17"/>
+        </w:rPr>
+        <w:t>Fig 7. Floor area to hold the position target, by concept, vs the 7,000 m² envelope.</w:t>
+      </w:r>
+    </w:p>
+    <w:p>
+      <w:pPr>
+        <w:pStyle w:val="Heading1"/>
+      </w:pPr>
+      <w:r>
+        <w:t>11. Design options</w:t>
+      </w:r>
+    </w:p>
+    <w:p>
+      <w:pPr>
+        <w:spacing w:after="120"/>
+      </w:pPr>
+      <w:r>
+        <w:rPr>
+          <w:b w:val="0"/>
+          <w:i w:val="0"/>
+          <w:color w:val="222222"/>
+          <w:sz w:val="21"/>
+        </w:rPr>
+        <w:t>Three end-to-end options (storage × picking × MHE × policies), each aligned across the four processes.</w:t>
+      </w:r>
+    </w:p>
+    <w:p>
+      <w:pPr>
+        <w:pStyle w:val="Heading2"/>
+      </w:pPr>
+      <w:r>
+        <w:t>Option A — Conventional+ (improve the current concept)</w:t>
+      </w:r>
+    </w:p>
+    <w:p>
+      <w:pPr>
+        <w:pStyle w:val="ListBullet"/>
+      </w:pPr>
+      <w:r>
+        <w:rPr>
+          <w:b w:val="0"/>
+          <w:sz w:val="21"/>
+        </w:rPr>
+      </w:r>
+      <w:r>
+        <w:rPr>
+          <w:b/>
+          <w:sz w:val="21"/>
+        </w:rPr>
+        <w:t>Storage:</w:t>
+      </w:r>
+      <w:r>
+        <w:rPr>
+          <w:b w:val="0"/>
+          <w:sz w:val="21"/>
+        </w:rPr>
+        <w:t xml:space="preserve"> selective single-deep, narrow-aisle (reach), 7 levels; two-zone ABC. ~7,500 m² (borderline).</w:t>
+      </w:r>
+    </w:p>
+    <w:p>
+      <w:pPr>
+        <w:pStyle w:val="ListBullet"/>
+      </w:pPr>
+      <w:r>
+        <w:rPr>
+          <w:b w:val="0"/>
+          <w:sz w:val="21"/>
+        </w:rPr>
+      </w:r>
+      <w:r>
+        <w:rPr>
+          <w:b/>
+          <w:sz w:val="21"/>
+        </w:rPr>
+        <w:t>Picking:</w:t>
+      </w:r>
+      <w:r>
+        <w:rPr>
+          <w:b w:val="0"/>
+          <w:sz w:val="21"/>
+        </w:rPr>
+        <w:t xml:space="preserve"> RF-directed discrete + simple batch; case pick from pick-face; pallet from reserve.</w:t>
+      </w:r>
+    </w:p>
+    <w:p>
+      <w:pPr>
+        <w:pStyle w:val="ListBullet"/>
+      </w:pPr>
+      <w:r>
+        <w:rPr>
+          <w:b w:val="0"/>
+          <w:sz w:val="21"/>
+        </w:rPr>
+      </w:r>
+      <w:r>
+        <w:rPr>
+          <w:b/>
+          <w:sz w:val="21"/>
+        </w:rPr>
+        <w:t>MHE:</w:t>
+      </w:r>
+      <w:r>
+        <w:rPr>
+          <w:b w:val="0"/>
+          <w:sz w:val="21"/>
+        </w:rPr>
+        <w:t xml:space="preserve"> reach trucks, low-level order pickers, pallet trucks, RF scanners.</w:t>
+      </w:r>
+    </w:p>
+    <w:p>
+      <w:pPr>
+        <w:pStyle w:val="ListBullet"/>
+      </w:pPr>
+      <w:r>
+        <w:rPr>
+          <w:b w:val="0"/>
+          <w:sz w:val="21"/>
+        </w:rPr>
+      </w:r>
+      <w:r>
+        <w:rPr>
+          <w:b/>
+          <w:sz w:val="21"/>
+        </w:rPr>
+        <w:t>Verdict:</w:t>
+      </w:r>
+      <w:r>
+        <w:rPr>
+          <w:b w:val="0"/>
+          <w:sz w:val="21"/>
+        </w:rPr>
+        <w:t xml:space="preserve"> cheapest and simplest, but only just fits, with the highest travel and labour.</w:t>
+      </w:r>
+    </w:p>
+    <w:p>
+      <w:pPr>
+        <w:pStyle w:val="Heading2"/>
+      </w:pPr>
+      <w:r>
+        <w:t>Option B — Hybrid density + velocity slotting + zone/batch picking  (recommended)</w:t>
+      </w:r>
+    </w:p>
+    <w:p>
+      <w:pPr>
+        <w:pStyle w:val="ListBullet"/>
+      </w:pPr>
+      <w:r>
+        <w:rPr>
+          <w:b w:val="0"/>
+          <w:sz w:val="21"/>
+        </w:rPr>
+      </w:r>
+      <w:r>
+        <w:rPr>
+          <w:b/>
+          <w:sz w:val="21"/>
+        </w:rPr>
+        <w:t>Storage:</w:t>
+      </w:r>
+      <w:r>
+        <w:rPr>
+          <w:b w:val="0"/>
+          <w:sz w:val="21"/>
+        </w:rPr>
+        <w:t xml:space="preserve"> double-deep reach racking for A/B reserve + selective single-deep for irregular SKUs + a forward-pick module (carton-flow / shelving) for fast case/each; cantilever for XLONG goods. ~6,000–6,400 m².</w:t>
+      </w:r>
+    </w:p>
+    <w:p>
+      <w:pPr>
+        <w:pStyle w:val="ListBullet"/>
+      </w:pPr>
+      <w:r>
+        <w:rPr>
+          <w:b w:val="0"/>
+          <w:sz w:val="21"/>
+        </w:rPr>
+      </w:r>
+      <w:r>
+        <w:rPr>
+          <w:b/>
+          <w:sz w:val="21"/>
+        </w:rPr>
+        <w:t>Picking:</w:t>
+      </w:r>
+      <w:r>
+        <w:rPr>
+          <w:b w:val="0"/>
+          <w:sz w:val="21"/>
+        </w:rPr>
+        <w:t xml:space="preserve"> zone + batch/wave picking (batches the 50% single-line orders); A-movers in a golden-zone forward pick; voice/RF; put-to-light consolidation at pack.</w:t>
+      </w:r>
+    </w:p>
+    <w:p>
+      <w:pPr>
+        <w:pStyle w:val="ListBullet"/>
+      </w:pPr>
+      <w:r>
+        <w:rPr>
+          <w:b w:val="0"/>
+          <w:sz w:val="21"/>
+        </w:rPr>
+      </w:r>
+      <w:r>
+        <w:rPr>
+          <w:b/>
+          <w:sz w:val="21"/>
+        </w:rPr>
+        <w:t>MHE:</w:t>
+      </w:r>
+      <w:r>
+        <w:rPr>
+          <w:b w:val="0"/>
+          <w:sz w:val="21"/>
+        </w:rPr>
+        <w:t xml:space="preserve"> deep-reach trucks, order pickers, pallet trucks, voice/RF, print-and-apply.</w:t>
+      </w:r>
+    </w:p>
+    <w:p>
+      <w:pPr>
+        <w:pStyle w:val="ListBullet"/>
+      </w:pPr>
+      <w:r>
+        <w:rPr>
+          <w:b w:val="0"/>
+          <w:sz w:val="21"/>
+        </w:rPr>
+      </w:r>
+      <w:r>
+        <w:rPr>
+          <w:b/>
+          <w:sz w:val="21"/>
+        </w:rPr>
+        <w:t>Policies:</w:t>
+      </w:r>
+      <w:r>
+        <w:rPr>
+          <w:b w:val="0"/>
+          <w:sz w:val="21"/>
+        </w:rPr>
+        <w:t xml:space="preserve"> velocity (demand-ABC) slotting, hybrid random-within-zone storage, min/max replenishment, FIFO via FIF DATE where relevant.</w:t>
+      </w:r>
+    </w:p>
+    <w:p>
+      <w:pPr>
+        <w:pStyle w:val="ListBullet"/>
+      </w:pPr>
+      <w:r>
+        <w:rPr>
+          <w:b w:val="0"/>
+          <w:sz w:val="21"/>
+        </w:rPr>
+      </w:r>
+      <w:r>
+        <w:rPr>
+          <w:b/>
+          <w:sz w:val="21"/>
+        </w:rPr>
+        <w:t>Verdict:</w:t>
+      </w:r>
+      <w:r>
+        <w:rPr>
+          <w:b w:val="0"/>
+          <w:sz w:val="21"/>
+        </w:rPr>
+        <w:t xml:space="preserve"> fits with buffer, materially lower travel/labour than A, moderate CAPEX — strongest business case.</w:t>
+      </w:r>
+    </w:p>
+    <w:p>
+      <w:pPr>
+        <w:pStyle w:val="Heading2"/>
+      </w:pPr>
+      <w:r>
+        <w:t>Option C — High-density / semi-automated</w:t>
+      </w:r>
+    </w:p>
+    <w:p>
+      <w:pPr>
+        <w:pStyle w:val="ListBullet"/>
+      </w:pPr>
+      <w:r>
+        <w:rPr>
+          <w:b w:val="0"/>
+          <w:sz w:val="21"/>
+        </w:rPr>
+      </w:r>
+      <w:r>
+        <w:rPr>
+          <w:b/>
+          <w:sz w:val="21"/>
+        </w:rPr>
+        <w:t>Storage:</w:t>
+      </w:r>
+      <w:r>
+        <w:rPr>
+          <w:b w:val="0"/>
+          <w:sz w:val="21"/>
+        </w:rPr>
+        <w:t xml:space="preserve"> VNA (man-up turret) for reserve + automated small-parts store (shuttle/AutoStore-style) for the large C each-pick tail. ~5,000 m².</w:t>
+      </w:r>
+    </w:p>
+    <w:p>
+      <w:pPr>
+        <w:pStyle w:val="ListBullet"/>
+      </w:pPr>
+      <w:r>
+        <w:rPr>
+          <w:b w:val="0"/>
+          <w:sz w:val="21"/>
+        </w:rPr>
+      </w:r>
+      <w:r>
+        <w:rPr>
+          <w:b/>
+          <w:sz w:val="21"/>
+        </w:rPr>
+        <w:t>Picking:</w:t>
+      </w:r>
+      <w:r>
+        <w:rPr>
+          <w:b w:val="0"/>
+          <w:sz w:val="21"/>
+        </w:rPr>
+        <w:t xml:space="preserve"> goods-to-person / pick-to-light for smalls; VNA combined storage+pick; automated sortation.</w:t>
+      </w:r>
+    </w:p>
+    <w:p>
+      <w:pPr>
+        <w:pStyle w:val="ListBullet"/>
+      </w:pPr>
+      <w:r>
+        <w:rPr>
+          <w:b w:val="0"/>
+          <w:sz w:val="21"/>
+        </w:rPr>
+      </w:r>
+      <w:r>
+        <w:rPr>
+          <w:b/>
+          <w:sz w:val="21"/>
+        </w:rPr>
+        <w:t>MHE:</w:t>
+      </w:r>
+      <w:r>
+        <w:rPr>
+          <w:b w:val="0"/>
+          <w:sz w:val="21"/>
+        </w:rPr>
+        <w:t xml:space="preserve"> VNA turret trucks + guidance, automation modules, minimal manual MHE.</w:t>
+      </w:r>
+    </w:p>
+    <w:p>
+      <w:pPr>
+        <w:pStyle w:val="ListBullet"/>
+      </w:pPr>
+      <w:r>
+        <w:rPr>
+          <w:b w:val="0"/>
+          <w:sz w:val="21"/>
+        </w:rPr>
+      </w:r>
+      <w:r>
+        <w:rPr>
+          <w:b/>
+          <w:sz w:val="21"/>
+        </w:rPr>
+        <w:t>Verdict:</w:t>
+      </w:r>
+      <w:r>
+        <w:rPr>
+          <w:b w:val="0"/>
+          <w:sz w:val="21"/>
+        </w:rPr>
+        <w:t xml:space="preserve"> densest and lowest labour, but highest CAPEX and complexity; ROI depends on labour cost.</w:t>
+      </w:r>
+    </w:p>
+    <w:p>
+      <w:pPr>
+        <w:pStyle w:val="Heading1"/>
+      </w:pPr>
+      <w:r>
+        <w:t>12. Decision matrix &amp; recommendation</w:t>
+      </w:r>
+    </w:p>
+    <w:tbl>
+      <w:tblPr>
+        <w:tblStyle w:val="LightGrid-Accent1"/>
+        <w:tblW w:type="auto" w:w="0"/>
+        <w:jc w:val="center"/>
+        <w:tblLook w:firstColumn="1" w:firstRow="1" w:lastColumn="0" w:lastRow="0" w:noHBand="0" w:noVBand="1" w:val="04A0"/>
+      </w:tblPr>
+      <w:tblGrid>
+        <w:gridCol w:w="2880"/>
+        <w:gridCol w:w="2880"/>
+        <w:gridCol w:w="2880"/>
+      </w:tblGrid>
+      <w:tr>
+        <w:tc>
+          <w:tcPr>
+            <w:tcW w:type="dxa" w:w="3402"/>
+          </w:tcPr>
+          <w:p>
+            <w:r/>
+            <w:r>
+              <w:rPr>
+                <w:b/>
+                <w:sz w:val="19"/>
+              </w:rPr>
+              <w:t>Option</w:t>
+            </w:r>
+          </w:p>
+        </w:tc>
+        <w:tc>
+          <w:tcPr>
+            <w:tcW w:type="dxa" w:w="2551"/>
+          </w:tcPr>
+          <w:p>
+            <w:r/>
+            <w:r>
+              <w:rPr>
+                <w:b/>
+                <w:sz w:val="19"/>
+              </w:rPr>
+              <w:t>Weighted score (max 5)</w:t>
+            </w:r>
+          </w:p>
+        </w:tc>
+        <w:tc>
+          <w:tcPr>
+            <w:tcW w:type="dxa" w:w="2551"/>
+          </w:tcPr>
+          <w:p>
+            <w:r/>
+            <w:r>
+              <w:rPr>
+                <w:b/>
+                <w:sz w:val="19"/>
+              </w:rPr>
+              <w:t>Result</w:t>
+            </w:r>
+          </w:p>
+        </w:tc>
+      </w:tr>
+      <w:tr>
+        <w:tc>
+          <w:tcPr>
+            <w:tcW w:type="dxa" w:w="3402"/>
+          </w:tcPr>
+          <w:p>
+            <w:r/>
+            <w:r>
+              <w:rPr>
+                <w:sz w:val="19"/>
+              </w:rPr>
+              <w:t>B - Hybrid density</w:t>
+            </w:r>
+          </w:p>
+        </w:tc>
+        <w:tc>
+          <w:tcPr>
+            <w:tcW w:type="dxa" w:w="2551"/>
+          </w:tcPr>
+          <w:p>
+            <w:pPr>
+              <w:jc w:val="right"/>
+            </w:pPr>
+            <w:r/>
+            <w:r>
+              <w:rPr>
+                <w:sz w:val="19"/>
+              </w:rPr>
+              <w:t>3.75</w:t>
+            </w:r>
+          </w:p>
+        </w:tc>
+        <w:tc>
+          <w:tcPr>
+            <w:tcW w:type="dxa" w:w="2551"/>
+          </w:tcPr>
+          <w:p>
+            <w:pPr>
+              <w:jc w:val="right"/>
+            </w:pPr>
+            <w:r/>
+            <w:r>
+              <w:rPr>
+                <w:sz w:val="19"/>
+              </w:rPr>
+              <w:t>RECOMMENDED</w:t>
+            </w:r>
+          </w:p>
+        </w:tc>
+      </w:tr>
+      <w:tr>
+        <w:tc>
+          <w:tcPr>
+            <w:tcW w:type="dxa" w:w="3402"/>
+          </w:tcPr>
+          <w:p>
+            <w:r/>
+            <w:r>
+              <w:rPr>
+                <w:sz w:val="19"/>
+              </w:rPr>
+              <w:t>C - Semi-automated</w:t>
+            </w:r>
+          </w:p>
+        </w:tc>
+        <w:tc>
+          <w:tcPr>
+            <w:tcW w:type="dxa" w:w="2551"/>
+          </w:tcPr>
+          <w:p>
+            <w:pPr>
+              <w:jc w:val="right"/>
+            </w:pPr>
+            <w:r/>
+            <w:r>
+              <w:rPr>
+                <w:sz w:val="19"/>
+              </w:rPr>
+              <w:t>3.70</w:t>
+            </w:r>
+          </w:p>
+        </w:tc>
+        <w:tc>
+          <w:tcPr>
+            <w:tcW w:type="dxa" w:w="2551"/>
+          </w:tcPr>
+          <w:p>
+            <w:pPr>
+              <w:jc w:val="right"/>
+            </w:pPr>
+            <w:r/>
+            <w:r>
+              <w:rPr>
+                <w:sz w:val="19"/>
+              </w:rPr>
+              <w:t>Strong alternative</w:t>
+            </w:r>
+          </w:p>
+        </w:tc>
+      </w:tr>
+      <w:tr>
+        <w:tc>
+          <w:tcPr>
+            <w:tcW w:type="dxa" w:w="3402"/>
+          </w:tcPr>
+          <w:p>
+            <w:r/>
+            <w:r>
+              <w:rPr>
+                <w:sz w:val="19"/>
+              </w:rPr>
+              <w:t>A - Conventional+</w:t>
+            </w:r>
+          </w:p>
+        </w:tc>
+        <w:tc>
+          <w:tcPr>
+            <w:tcW w:type="dxa" w:w="2551"/>
+          </w:tcPr>
+          <w:p>
+            <w:pPr>
+              <w:jc w:val="right"/>
+            </w:pPr>
+            <w:r/>
+            <w:r>
+              <w:rPr>
+                <w:sz w:val="19"/>
+              </w:rPr>
+              <w:t>3.05</w:t>
+            </w:r>
+          </w:p>
+        </w:tc>
+        <w:tc>
+          <w:tcPr>
+            <w:tcW w:type="dxa" w:w="2551"/>
+          </w:tcPr>
+          <w:p>
+            <w:pPr>
+              <w:jc w:val="right"/>
+            </w:pPr>
+            <w:r/>
+            <w:r>
+              <w:rPr>
+                <w:sz w:val="19"/>
+              </w:rPr>
+              <w:t>Baseline</w:t>
+            </w:r>
+          </w:p>
+        </w:tc>
+      </w:tr>
+    </w:tbl>
+    <w:p>
+      <w:pPr>
+        <w:spacing w:after="40"/>
+      </w:pPr>
+    </w:p>
+    <w:p>
+      <w:pPr>
+        <w:spacing w:after="80"/>
+      </w:pPr>
+      <w:r>
+        <w:rPr>
+          <w:b w:val="0"/>
+          <w:i w:val="0"/>
+          <w:color w:val="222222"/>
+          <w:sz w:val="21"/>
+        </w:rPr>
+        <w:t>Weight-sensitivity (robustness):</w:t>
+      </w:r>
+    </w:p>
+    <w:tbl>
+      <w:tblPr>
+        <w:tblStyle w:val="LightGrid-Accent1"/>
+        <w:tblW w:type="auto" w:w="0"/>
+        <w:jc w:val="center"/>
+        <w:tblLook w:firstColumn="1" w:firstRow="1" w:lastColumn="0" w:lastRow="0" w:noHBand="0" w:noVBand="1" w:val="04A0"/>
+      </w:tblPr>
+      <w:tblGrid>
+        <w:gridCol w:w="2160"/>
+        <w:gridCol w:w="2160"/>
+        <w:gridCol w:w="2160"/>
+        <w:gridCol w:w="2160"/>
+      </w:tblGrid>
+      <w:tr>
+        <w:tc>
+          <w:tcPr>
+            <w:tcW w:type="dxa" w:w="3402"/>
+          </w:tcPr>
+          <w:p>
+            <w:r/>
+            <w:r>
+              <w:rPr>
+                <w:b/>
+                <w:sz w:val="19"/>
+              </w:rPr>
+              <w:t>Option</w:t>
+            </w:r>
+          </w:p>
+        </w:tc>
+        <w:tc>
+          <w:tcPr>
+            <w:tcW w:type="dxa" w:w="1701"/>
+          </w:tcPr>
+          <w:p>
+            <w:r/>
+            <w:r>
+              <w:rPr>
+                <w:b/>
+                <w:sz w:val="19"/>
+              </w:rPr>
+              <w:t>Base</w:t>
+            </w:r>
+          </w:p>
+        </w:tc>
+        <w:tc>
+          <w:tcPr>
+            <w:tcW w:type="dxa" w:w="1701"/>
+          </w:tcPr>
+          <w:p>
+            <w:r/>
+            <w:r>
+              <w:rPr>
+                <w:b/>
+                <w:sz w:val="19"/>
+              </w:rPr>
+              <w:t>Cost-driven</w:t>
+            </w:r>
+          </w:p>
+        </w:tc>
+        <w:tc>
+          <w:tcPr>
+            <w:tcW w:type="dxa" w:w="1701"/>
+          </w:tcPr>
+          <w:p>
+            <w:r/>
+            <w:r>
+              <w:rPr>
+                <w:b/>
+                <w:sz w:val="19"/>
+              </w:rPr>
+              <w:t>Space-driven</w:t>
+            </w:r>
+          </w:p>
+        </w:tc>
+      </w:tr>
+      <w:tr>
+        <w:tc>
+          <w:tcPr>
+            <w:tcW w:type="dxa" w:w="3402"/>
+          </w:tcPr>
+          <w:p>
+            <w:r/>
+            <w:r>
+              <w:rPr>
+                <w:sz w:val="19"/>
+              </w:rPr>
+              <w:t>B - Hybrid density</w:t>
+            </w:r>
+          </w:p>
+        </w:tc>
+        <w:tc>
+          <w:tcPr>
+            <w:tcW w:type="dxa" w:w="1701"/>
+          </w:tcPr>
+          <w:p>
+            <w:pPr>
+              <w:jc w:val="right"/>
+            </w:pPr>
+            <w:r/>
+            <w:r>
+              <w:rPr>
+                <w:sz w:val="19"/>
+              </w:rPr>
+              <w:t>3.75</w:t>
+            </w:r>
+          </w:p>
+        </w:tc>
+        <w:tc>
+          <w:tcPr>
+            <w:tcW w:type="dxa" w:w="1701"/>
+          </w:tcPr>
+          <w:p>
+            <w:pPr>
+              <w:jc w:val="right"/>
+            </w:pPr>
+            <w:r/>
+            <w:r>
+              <w:rPr>
+                <w:sz w:val="19"/>
+              </w:rPr>
+              <w:t>3.65</w:t>
+            </w:r>
+          </w:p>
+        </w:tc>
+        <w:tc>
+          <w:tcPr>
+            <w:tcW w:type="dxa" w:w="1701"/>
+          </w:tcPr>
+          <w:p>
+            <w:pPr>
+              <w:jc w:val="right"/>
+            </w:pPr>
+            <w:r/>
+            <w:r>
+              <w:rPr>
+                <w:sz w:val="19"/>
+              </w:rPr>
+              <w:t>4.75</w:t>
+            </w:r>
+          </w:p>
+        </w:tc>
+      </w:tr>
+      <w:tr>
+        <w:tc>
+          <w:tcPr>
+            <w:tcW w:type="dxa" w:w="3402"/>
+          </w:tcPr>
+          <w:p>
+            <w:r/>
+            <w:r>
+              <w:rPr>
+                <w:sz w:val="19"/>
+              </w:rPr>
+              <w:t>C - Semi-automated</w:t>
+            </w:r>
+          </w:p>
+        </w:tc>
+        <w:tc>
+          <w:tcPr>
+            <w:tcW w:type="dxa" w:w="1701"/>
+          </w:tcPr>
+          <w:p>
+            <w:pPr>
+              <w:jc w:val="right"/>
+            </w:pPr>
+            <w:r/>
+            <w:r>
+              <w:rPr>
+                <w:sz w:val="19"/>
+              </w:rPr>
+              <w:t>3.70</w:t>
+            </w:r>
+          </w:p>
+        </w:tc>
+        <w:tc>
+          <w:tcPr>
+            <w:tcW w:type="dxa" w:w="1701"/>
+          </w:tcPr>
+          <w:p>
+            <w:pPr>
+              <w:jc w:val="right"/>
+            </w:pPr>
+            <w:r/>
+            <w:r>
+              <w:rPr>
+                <w:sz w:val="19"/>
+              </w:rPr>
+              <w:t>3.35</w:t>
+            </w:r>
+          </w:p>
+        </w:tc>
+        <w:tc>
+          <w:tcPr>
+            <w:tcW w:type="dxa" w:w="1701"/>
+          </w:tcPr>
+          <w:p>
+            <w:pPr>
+              <w:jc w:val="right"/>
+            </w:pPr>
+            <w:r/>
+            <w:r>
+              <w:rPr>
+                <w:sz w:val="19"/>
+              </w:rPr>
+              <w:t>4.85</w:t>
+            </w:r>
+          </w:p>
+        </w:tc>
+      </w:tr>
+      <w:tr>
+        <w:tc>
+          <w:tcPr>
+            <w:tcW w:type="dxa" w:w="3402"/>
+          </w:tcPr>
+          <w:p>
+            <w:r/>
+            <w:r>
+              <w:rPr>
+                <w:sz w:val="19"/>
+              </w:rPr>
+              <w:t>A - Conventional+</w:t>
+            </w:r>
+          </w:p>
+        </w:tc>
+        <w:tc>
+          <w:tcPr>
+            <w:tcW w:type="dxa" w:w="1701"/>
+          </w:tcPr>
+          <w:p>
+            <w:pPr>
+              <w:jc w:val="right"/>
+            </w:pPr>
+            <w:r/>
+            <w:r>
+              <w:rPr>
+                <w:sz w:val="19"/>
+              </w:rPr>
+              <w:t>3.05</w:t>
+            </w:r>
+          </w:p>
+        </w:tc>
+        <w:tc>
+          <w:tcPr>
+            <w:tcW w:type="dxa" w:w="1701"/>
+          </w:tcPr>
+          <w:p>
+            <w:pPr>
+              <w:jc w:val="right"/>
+            </w:pPr>
+            <w:r/>
+            <w:r>
+              <w:rPr>
+                <w:sz w:val="19"/>
+              </w:rPr>
+              <w:t>3.35</w:t>
+            </w:r>
+          </w:p>
+        </w:tc>
+        <w:tc>
+          <w:tcPr>
+            <w:tcW w:type="dxa" w:w="1701"/>
+          </w:tcPr>
+          <w:p>
+            <w:pPr>
+              <w:jc w:val="right"/>
+            </w:pPr>
+            <w:r/>
+            <w:r>
+              <w:rPr>
+                <w:sz w:val="19"/>
+              </w:rPr>
+              <w:t>3.55</w:t>
+            </w:r>
+          </w:p>
+        </w:tc>
+      </w:tr>
+    </w:tbl>
+    <w:p>
+      <w:pPr>
+        <w:spacing w:after="40"/>
+      </w:pPr>
+    </w:p>
+    <w:p>
+      <w:pPr>
+        <w:jc w:val="center"/>
+      </w:pPr>
+      <w:r>
+        <w:drawing>
+          <wp:inline xmlns:a="http://schemas.openxmlformats.org/drawingml/2006/main" xmlns:pic="http://schemas.openxmlformats.org/drawingml/2006/picture">
+            <wp:extent cx="4320000" cy="2371873"/>
+            <wp:docPr id="8" name="Picture 8"/>
+            <wp:cNvGraphicFramePr>
+              <a:graphicFrameLocks noChangeAspect="1"/>
+            </wp:cNvGraphicFramePr>
+            <a:graphic>
+              <a:graphicData uri="http://schemas.openxmlformats.org/drawingml/2006/picture">
+                <pic:pic>
+                  <pic:nvPicPr>
+                    <pic:cNvPr id="0" name="decision_matrix.png"/>
+                    <pic:cNvPicPr/>
+                  </pic:nvPicPr>
+                  <pic:blipFill>
+                    <a:blip r:embed="rId16"/>
+                    <a:stretch>
+                      <a:fillRect/>
+                    </a:stretch>
+                  </pic:blipFill>
+                  <pic:spPr>
+                    <a:xfrm>
+                      <a:off x="0" y="0"/>
+                      <a:ext cx="4320000" cy="2371873"/>
+                    </a:xfrm>
+                    <a:prstGeom prst="rect"/>
+                  </pic:spPr>
+                </pic:pic>
+              </a:graphicData>
+            </a:graphic>
+          </wp:inline>
+        </w:drawing>
+      </w:r>
+    </w:p>
+    <w:p>
+      <w:pPr>
+        <w:spacing w:after="200"/>
+        <w:jc w:val="center"/>
+      </w:pPr>
+      <w:r>
+        <w:rPr>
+          <w:b w:val="0"/>
+          <w:i/>
+          <w:color w:val="666666"/>
+          <w:sz w:val="17"/>
+        </w:rPr>
+        <w:t>Fig 8. Weighted decision-matrix scores.</w:t>
+      </w:r>
+    </w:p>
+    <w:p>
+      <w:pPr>
+        <w:pStyle w:val="ListBullet"/>
+      </w:pPr>
+      <w:r>
+        <w:rPr>
+          <w:b w:val="0"/>
+          <w:sz w:val="21"/>
+        </w:rPr>
+      </w:r>
+      <w:r>
+        <w:rPr>
+          <w:b/>
+          <w:sz w:val="21"/>
+        </w:rPr>
+        <w:t>Recommended: B - Hybrid density.</w:t>
+      </w:r>
+      <w:r>
+        <w:rPr>
+          <w:b w:val="0"/>
+          <w:sz w:val="21"/>
+        </w:rPr>
+        <w:t xml:space="preserve"> It wins on base and cost-driven weightings; C overtakes only when space is the dominant criterion — likely if A008 resolves to a small Assa-only envelope.</w:t>
+      </w:r>
+    </w:p>
+    <w:p>
+      <w:pPr>
+        <w:pStyle w:val="ListBullet"/>
+      </w:pPr>
+      <w:r>
+        <w:rPr>
+          <w:b w:val="0"/>
+          <w:sz w:val="21"/>
+        </w:rPr>
+      </w:r>
+      <w:r>
+        <w:rPr>
+          <w:b/>
+          <w:sz w:val="21"/>
+        </w:rPr>
+        <w:t>Why (data):</w:t>
+      </w:r>
+      <w:r>
+        <w:rPr>
+          <w:b w:val="0"/>
+          <w:sz w:val="21"/>
+        </w:rPr>
+        <w:t xml:space="preserve"> double-deep fits at 91% where wide-aisle (144%) does not; 83% of lifts are case picking and 50% of orders single-line → batch/zone picking is the biggest labour lever; 48.6% ABC mismatch → velocity slotting is a cheap, high-value win; 73% single-load tail → dense reserve + fast forward pick.</w:t>
+      </w:r>
+    </w:p>
+    <w:p>
+      <w:pPr>
+        <w:pStyle w:val="ListBullet"/>
+      </w:pPr>
+      <w:r>
+        <w:rPr>
+          <w:b w:val="0"/>
+          <w:sz w:val="21"/>
+        </w:rPr>
+      </w:r>
+      <w:r>
+        <w:rPr>
+          <w:b/>
+          <w:sz w:val="21"/>
+        </w:rPr>
+        <w:t>Conditions before locking:</w:t>
+      </w:r>
+      <w:r>
+        <w:rPr>
+          <w:b w:val="0"/>
+          <w:sz w:val="21"/>
+        </w:rPr>
+        <w:t xml:space="preserve"> confirm the 7,000 m² scope (A008); obtain labour/equipment costs (A006) to confirm B vs C in the financial model; validate double-deep against the EURO/K3/XLONG pallet mix.</w:t>
+      </w:r>
+    </w:p>
+    <w:p>
+      <w:pPr>
+        <w:pStyle w:val="Heading1"/>
+      </w:pPr>
+      <w:r>
+        <w:t>13. Assumptions &amp; open questions</w:t>
       </w:r>
     </w:p>
     <w:p>
@@ -4010,6 +5812,53 @@
           </w:p>
         </w:tc>
       </w:tr>
+      <w:tr>
+        <w:tc>
+          <w:tcPr>
+            <w:tcW w:type="dxa" w:w="850"/>
+          </w:tcPr>
+          <w:p>
+            <w:r/>
+            <w:r>
+              <w:rPr>
+                <w:sz w:val="19"/>
+              </w:rPr>
+              <w:t>A010</w:t>
+            </w:r>
+          </w:p>
+        </w:tc>
+        <w:tc>
+          <w:tcPr>
+            <w:tcW w:type="dxa" w:w="6520"/>
+          </w:tcPr>
+          <w:p>
+            <w:r/>
+            <w:r>
+              <w:rPr>
+                <w:sz w:val="19"/>
+              </w:rPr>
+              <w:t>Design pallet-position target</w:t>
+            </w:r>
+          </w:p>
+        </w:tc>
+        <w:tc>
+          <w:tcPr>
+            <w:tcW w:type="dxa" w:w="1134"/>
+          </w:tcPr>
+          <w:p>
+            <w:pPr>
+              <w:jc w:val="right"/>
+            </w:pPr>
+            <w:r/>
+            <w:r>
+              <w:rPr>
+                <w:sz w:val="19"/>
+              </w:rPr>
+              <w:t>HIGH</w:t>
+            </w:r>
+          </w:p>
+        </w:tc>
+      </w:tr>
     </w:tbl>
     <w:p>
       <w:pPr>
@@ -4031,7 +5880,7 @@
       </w:r>
     </w:p>
     <w:sectPr>
-      <w:footerReference w:type="default" r:id="rId15"/>
+      <w:footerReference w:type="default" r:id="rId17"/>
       <w:pgSz w:w="12240" w:h="15840"/>
       <w:pgMar w:top="1440" w:right="1800" w:bottom="1440" w:left="1800" w:header="720" w:footer="720" w:gutter="0"/>
       <w:cols w:space="720"/>

</xml_diff>

<commit_message>
Add average delivery lead time (78.3h) to Deliverable 1 report
Co-Authored-By: Claude Opus 4.8 <noreply@anthropic.com>
</commit_message>
<xml_diff>
--- a/outputs/reports/Deliverable1_Analysis_DRAFT.docx
+++ b/outputs/reports/Deliverable1_Analysis_DRAFT.docx
@@ -1927,21 +1927,21 @@
           <w:b w:val="0"/>
           <w:sz w:val="21"/>
         </w:rPr>
-        <w:t xml:space="preserve">Delivery lead time (order received → dispatched): median </w:t>
+        <w:t xml:space="preserve">Delivery lead time (order received → dispatched): </w:t>
       </w:r>
       <w:r>
         <w:rPr>
           <w:b/>
           <w:sz w:val="21"/>
         </w:rPr>
-        <w:t>52.4 h (~2.2 days)</w:t>
+        <w:t>average 78.3 h (~3.3 days)</w:t>
       </w:r>
       <w:r>
         <w:rPr>
           <w:b w:val="0"/>
           <w:sz w:val="21"/>
         </w:rPr>
-        <w:t>, p90 166.9 h.</w:t>
+        <w:t>, median 52.4 h (~2.2 days), p90 166.9 h. Right-skewed (mean &gt; median), so the typical order is nearer the median; measured as TRAILER DISPATCED DATE − ORDER ARRIVE DATE.</w:t>
       </w:r>
     </w:p>
     <w:p>
@@ -5859,6 +5859,53 @@
           </w:p>
         </w:tc>
       </w:tr>
+      <w:tr>
+        <w:tc>
+          <w:tcPr>
+            <w:tcW w:type="dxa" w:w="850"/>
+          </w:tcPr>
+          <w:p>
+            <w:r/>
+            <w:r>
+              <w:rPr>
+                <w:sz w:val="19"/>
+              </w:rPr>
+              <w:t>A014</w:t>
+            </w:r>
+          </w:p>
+        </w:tc>
+        <w:tc>
+          <w:tcPr>
+            <w:tcW w:type="dxa" w:w="6520"/>
+          </w:tcPr>
+          <w:p>
+            <w:r/>
+            <w:r>
+              <w:rPr>
+                <w:sz w:val="19"/>
+              </w:rPr>
+              <w:t>Labour productivity benchmarks (units/person-hour)</w:t>
+            </w:r>
+          </w:p>
+        </w:tc>
+        <w:tc>
+          <w:tcPr>
+            <w:tcW w:type="dxa" w:w="1134"/>
+          </w:tcPr>
+          <w:p>
+            <w:pPr>
+              <w:jc w:val="right"/>
+            </w:pPr>
+            <w:r/>
+            <w:r>
+              <w:rPr>
+                <w:sz w:val="19"/>
+              </w:rPr>
+              <w:t>HIGH</w:t>
+            </w:r>
+          </w:p>
+        </w:tc>
+      </w:tr>
     </w:tbl>
     <w:p>
       <w:pPr>

</xml_diff>